<commit_message>
Add Euglenophytes content, filament length field, and previous-name styling
Re-extract from revised Bangia and Cryptophytes Word files and new Euglenophytes source (20 catalog records). Split Filament length into its own quick fact after cell biovolume. Render previous scientific names at title size. Include glossary source doc for a future glossary page.

Co-authored-by: Cursor <cursoragent@cursor.com>
</commit_message>
<xml_diff>
--- a/data/raw/Bangia atropurpurea.docx
+++ b/data/raw/Bangia atropurpurea.docx
@@ -176,7 +176,7 @@
           <w:lang w:val="en-US"/>
         </w:rPr>
         <w:drawing>
-          <wp:inline distT="0" distB="0" distL="0" distR="0" wp14:anchorId="6074B6E3" wp14:editId="4F02E723">
+          <wp:inline distT="0" distB="0" distL="0" distR="0" wp14:anchorId="6074B6E3" wp14:editId="013B570B">
             <wp:extent cx="2166555" cy="1900844"/>
             <wp:effectExtent l="0" t="0" r="5715" b="4445"/>
             <wp:docPr id="174453952" name="Picture 2"/>
@@ -382,7 +382,23 @@
           <w:b/>
           <w:lang w:val="en-US"/>
         </w:rPr>
-        <w:t>Distinctive attributes</w:t>
+        <w:t xml:space="preserve">Distinctive </w:t>
+      </w:r>
+      <w:r>
+        <w:rPr>
+          <w:rFonts w:asciiTheme="majorBidi" w:hAnsiTheme="majorBidi" w:cstheme="majorBidi"/>
+          <w:b/>
+          <w:lang w:val="en-US"/>
+        </w:rPr>
+        <w:t>featur</w:t>
+      </w:r>
+      <w:r>
+        <w:rPr>
+          <w:rFonts w:asciiTheme="majorBidi" w:hAnsiTheme="majorBidi" w:cstheme="majorBidi"/>
+          <w:b/>
+          <w:lang w:val="en-US"/>
+        </w:rPr>
+        <w:t>es</w:t>
       </w:r>
       <w:r>
         <w:rPr>
@@ -478,7 +494,23 @@
           <w:bCs/>
           <w:lang w:val="en-US"/>
         </w:rPr>
-        <w:t>The species is found in both marine and fresh waters.</w:t>
+        <w:t>The species is found in both marine and fresh waters</w:t>
+      </w:r>
+      <w:r>
+        <w:rPr>
+          <w:rFonts w:asciiTheme="majorBidi" w:hAnsiTheme="majorBidi" w:cstheme="majorBidi"/>
+          <w:bCs/>
+          <w:lang w:val="en-US"/>
+        </w:rPr>
+        <w:t>.</w:t>
+      </w:r>
+      <w:r>
+        <w:rPr>
+          <w:rFonts w:asciiTheme="majorBidi" w:hAnsiTheme="majorBidi" w:cstheme="majorBidi"/>
+          <w:bCs/>
+          <w:lang w:val="en-US"/>
+        </w:rPr>
+        <w:t xml:space="preserve"> </w:t>
       </w:r>
     </w:p>
     <w:p>
@@ -558,6 +590,33 @@
         <w:spacing w:after="0"/>
         <w:rPr>
           <w:rFonts w:asciiTheme="majorBidi" w:hAnsiTheme="majorBidi" w:cstheme="majorBidi"/>
+        </w:rPr>
+      </w:pPr>
+      <w:r>
+        <w:rPr>
+          <w:rFonts w:asciiTheme="majorBidi" w:hAnsiTheme="majorBidi" w:cstheme="majorBidi"/>
+          <w:b/>
+        </w:rPr>
+        <w:t>Cell shape</w:t>
+      </w:r>
+      <w:r>
+        <w:rPr>
+          <w:rFonts w:asciiTheme="majorBidi" w:hAnsiTheme="majorBidi" w:cstheme="majorBidi"/>
+        </w:rPr>
+        <w:t xml:space="preserve">: </w:t>
+      </w:r>
+      <w:r>
+        <w:rPr>
+          <w:rFonts w:asciiTheme="majorBidi" w:hAnsiTheme="majorBidi" w:cstheme="majorBidi"/>
+        </w:rPr>
+        <w:t>cylinder</w:t>
+      </w:r>
+    </w:p>
+    <w:p>
+      <w:pPr>
+        <w:spacing w:after="0"/>
+        <w:rPr>
+          <w:rFonts w:asciiTheme="majorBidi" w:hAnsiTheme="majorBidi" w:cstheme="majorBidi"/>
           <w:b/>
           <w:bCs/>
         </w:rPr>
@@ -625,33 +684,6 @@
           <w:rFonts w:asciiTheme="majorBidi" w:hAnsiTheme="majorBidi" w:cstheme="majorBidi"/>
         </w:rPr>
         <w:t>Several centimeters</w:t>
-      </w:r>
-    </w:p>
-    <w:p>
-      <w:pPr>
-        <w:spacing w:after="0"/>
-        <w:rPr>
-          <w:rFonts w:asciiTheme="majorBidi" w:hAnsiTheme="majorBidi" w:cstheme="majorBidi"/>
-        </w:rPr>
-      </w:pPr>
-      <w:r>
-        <w:rPr>
-          <w:rFonts w:asciiTheme="majorBidi" w:hAnsiTheme="majorBidi" w:cstheme="majorBidi"/>
-          <w:b/>
-        </w:rPr>
-        <w:t>Cell shape</w:t>
-      </w:r>
-      <w:r>
-        <w:rPr>
-          <w:rFonts w:asciiTheme="majorBidi" w:hAnsiTheme="majorBidi" w:cstheme="majorBidi"/>
-        </w:rPr>
-        <w:t xml:space="preserve">: </w:t>
-      </w:r>
-      <w:r>
-        <w:rPr>
-          <w:rFonts w:asciiTheme="majorBidi" w:hAnsiTheme="majorBidi" w:cstheme="majorBidi"/>
-        </w:rPr>
-        <w:t>cylinder</w:t>
       </w:r>
     </w:p>
     <w:p>
@@ -764,7 +796,19 @@
         <w:rPr>
           <w:rFonts w:asciiTheme="majorBidi" w:hAnsiTheme="majorBidi" w:cstheme="majorBidi"/>
         </w:rPr>
-        <w:t>with prominent</w:t>
+        <w:t xml:space="preserve">with </w:t>
+      </w:r>
+      <w:r>
+        <w:rPr>
+          <w:rFonts w:asciiTheme="majorBidi" w:hAnsiTheme="majorBidi" w:cstheme="majorBidi"/>
+        </w:rPr>
+        <w:t xml:space="preserve">a </w:t>
+      </w:r>
+      <w:r>
+        <w:rPr>
+          <w:rFonts w:asciiTheme="majorBidi" w:hAnsiTheme="majorBidi" w:cstheme="majorBidi"/>
+        </w:rPr>
+        <w:t>prominent</w:t>
       </w:r>
       <w:r>
         <w:rPr>
@@ -882,6 +926,7 @@
           <w:szCs w:val="22"/>
           <w:lang w:bidi="en-US"/>
         </w:rPr>
+        <w:lastRenderedPageBreak/>
         <w:drawing>
           <wp:inline distT="0" distB="0" distL="0" distR="0" wp14:anchorId="461814E9" wp14:editId="24E6F83A">
             <wp:extent cx="2540000" cy="1993900"/>
@@ -978,7 +1023,19 @@
         <w:rPr>
           <w:rFonts w:asciiTheme="majorBidi" w:hAnsiTheme="majorBidi" w:cstheme="majorBidi"/>
         </w:rPr>
-        <w:t xml:space="preserve">with young filaments </w:t>
+        <w:t>with young</w:t>
+      </w:r>
+      <w:r>
+        <w:rPr>
+          <w:rFonts w:asciiTheme="majorBidi" w:hAnsiTheme="majorBidi" w:cstheme="majorBidi"/>
+        </w:rPr>
+        <w:t>, uniseriate</w:t>
+      </w:r>
+      <w:r>
+        <w:rPr>
+          <w:rFonts w:asciiTheme="majorBidi" w:hAnsiTheme="majorBidi" w:cstheme="majorBidi"/>
+        </w:rPr>
+        <w:t xml:space="preserve"> filaments </w:t>
       </w:r>
       <w:r>
         <w:rPr>
@@ -1064,21 +1121,18 @@
       <w:r>
         <w:rPr>
           <w:rFonts w:asciiTheme="majorBidi" w:hAnsiTheme="majorBidi" w:cstheme="majorBidi"/>
-          <w:highlight w:val="yellow"/>
         </w:rPr>
         <w:t>P</w:t>
       </w:r>
       <w:r>
         <w:rPr>
           <w:rFonts w:asciiTheme="majorBidi" w:hAnsiTheme="majorBidi" w:cstheme="majorBidi"/>
-          <w:highlight w:val="yellow"/>
         </w:rPr>
         <w:t>late</w:t>
       </w:r>
       <w:r>
         <w:rPr>
           <w:rFonts w:asciiTheme="majorBidi" w:hAnsiTheme="majorBidi" w:cstheme="majorBidi"/>
-          <w:highlight w:val="yellow"/>
         </w:rPr>
         <w:t xml:space="preserve"> </w:t>
       </w:r>
@@ -1275,6 +1329,7 @@
           <w:szCs w:val="22"/>
           <w:lang w:bidi="en-US"/>
         </w:rPr>
+        <w:lastRenderedPageBreak/>
         <w:drawing>
           <wp:inline distT="0" distB="0" distL="0" distR="0" wp14:anchorId="5F95EE77" wp14:editId="55A5124B">
             <wp:extent cx="2540000" cy="2463800"/>
@@ -1659,6 +1714,49 @@
       <w:pPr>
         <w:rPr>
           <w:rFonts w:asciiTheme="majorBidi" w:hAnsiTheme="majorBidi" w:cstheme="majorBidi"/>
+        </w:rPr>
+      </w:pPr>
+      <w:r>
+        <w:rPr>
+          <w:rFonts w:asciiTheme="majorBidi" w:hAnsiTheme="majorBidi" w:cstheme="majorBidi"/>
+        </w:rPr>
+        <w:t xml:space="preserve">Most Rhodophytes are marine. Only ~ 3% of the ca. 5000 species of Rhodophytes occur in freshwaters, </w:t>
+      </w:r>
+      <w:r>
+        <w:rPr>
+          <w:rFonts w:asciiTheme="majorBidi" w:hAnsiTheme="majorBidi" w:cstheme="majorBidi"/>
+          <w:i/>
+          <w:iCs/>
+        </w:rPr>
+        <w:t xml:space="preserve">Bangia </w:t>
+      </w:r>
+      <w:r>
+        <w:rPr>
+          <w:rFonts w:asciiTheme="majorBidi" w:hAnsiTheme="majorBidi" w:cstheme="majorBidi"/>
+          <w:i/>
+          <w:iCs/>
+        </w:rPr>
+        <w:t>atro</w:t>
+      </w:r>
+      <w:r>
+        <w:rPr>
+          <w:rFonts w:asciiTheme="majorBidi" w:hAnsiTheme="majorBidi" w:cstheme="majorBidi"/>
+          <w:i/>
+          <w:iCs/>
+        </w:rPr>
+        <w:t>purpurea</w:t>
+      </w:r>
+      <w:r>
+        <w:rPr>
+          <w:rFonts w:asciiTheme="majorBidi" w:hAnsiTheme="majorBidi" w:cstheme="majorBidi"/>
+        </w:rPr>
+        <w:t xml:space="preserve"> is one of them. </w:t>
+      </w:r>
+    </w:p>
+    <w:p>
+      <w:pPr>
+        <w:rPr>
+          <w:rFonts w:asciiTheme="majorBidi" w:hAnsiTheme="majorBidi" w:cstheme="majorBidi"/>
           <w:bCs/>
         </w:rPr>
       </w:pPr>
@@ -1688,7 +1786,21 @@
           <w:rFonts w:asciiTheme="majorBidi" w:hAnsiTheme="majorBidi" w:cstheme="majorBidi"/>
           <w:bCs/>
         </w:rPr>
-        <w:t>. Can survive desiccation and extreme solar radiation (in the supra-littoral zone)</w:t>
+        <w:t xml:space="preserve">. </w:t>
+      </w:r>
+      <w:r>
+        <w:rPr>
+          <w:rFonts w:asciiTheme="majorBidi" w:hAnsiTheme="majorBidi" w:cstheme="majorBidi"/>
+          <w:bCs/>
+        </w:rPr>
+        <w:t xml:space="preserve">The same species is found in both marine and freshwater environments. </w:t>
+      </w:r>
+      <w:r>
+        <w:rPr>
+          <w:rFonts w:asciiTheme="majorBidi" w:hAnsiTheme="majorBidi" w:cstheme="majorBidi"/>
+          <w:bCs/>
+        </w:rPr>
+        <w:t>Can survive desiccation and extreme solar radiation (in the supra-littoral zone)</w:t>
       </w:r>
       <w:r>
         <w:rPr>
@@ -1697,6 +1809,109 @@
         </w:rPr>
         <w:t>.</w:t>
       </w:r>
+      <w:r>
+        <w:rPr>
+          <w:rFonts w:asciiTheme="majorBidi" w:hAnsiTheme="majorBidi" w:cstheme="majorBidi"/>
+          <w:bCs/>
+        </w:rPr>
+        <w:t xml:space="preserve"> The species is an indicator of fresh, clear water. </w:t>
+      </w:r>
+    </w:p>
+    <w:p>
+      <w:pPr>
+        <w:rPr>
+          <w:rFonts w:asciiTheme="majorBidi" w:hAnsiTheme="majorBidi" w:cstheme="majorBidi"/>
+          <w:b/>
+        </w:rPr>
+      </w:pPr>
+      <w:r>
+        <w:rPr>
+          <w:rFonts w:asciiTheme="majorBidi" w:hAnsiTheme="majorBidi" w:cstheme="majorBidi"/>
+          <w:b/>
+        </w:rPr>
+        <w:t>Fuarther reading:</w:t>
+      </w:r>
+    </w:p>
+    <w:p>
+      <w:pPr>
+        <w:rPr>
+          <w:rFonts w:asciiTheme="majorBidi" w:hAnsiTheme="majorBidi" w:cstheme="majorBidi"/>
+          <w:color w:val="333333"/>
+          <w:shd w:val="clear" w:color="auto" w:fill="FFFFFF"/>
+        </w:rPr>
+      </w:pPr>
+      <w:r>
+        <w:rPr>
+          <w:rFonts w:asciiTheme="majorBidi" w:hAnsiTheme="majorBidi" w:cstheme="majorBidi"/>
+          <w:color w:val="333333"/>
+          <w:shd w:val="clear" w:color="auto" w:fill="FFFFFF"/>
+        </w:rPr>
+        <w:t xml:space="preserve">Gargiulo GM, Genovese G, Morabito M, Culoso F, De Masi F. 2001. Sexual and asexual reproduction in a freshwater population of </w:t>
+      </w:r>
+      <w:r>
+        <w:rPr>
+          <w:rFonts w:asciiTheme="majorBidi" w:hAnsiTheme="majorBidi" w:cstheme="majorBidi"/>
+          <w:i/>
+          <w:iCs/>
+          <w:color w:val="333333"/>
+          <w:shd w:val="clear" w:color="auto" w:fill="FFFFFF"/>
+        </w:rPr>
+        <w:t>Bangia atropurpurea</w:t>
+      </w:r>
+      <w:r>
+        <w:rPr>
+          <w:rFonts w:asciiTheme="majorBidi" w:hAnsiTheme="majorBidi" w:cstheme="majorBidi"/>
+          <w:color w:val="333333"/>
+          <w:shd w:val="clear" w:color="auto" w:fill="FFFFFF"/>
+        </w:rPr>
+        <w:t xml:space="preserve"> (Bangiales, Rhodophyta) from eastern Sicily (Italy). </w:t>
+      </w:r>
+      <w:r>
+        <w:rPr>
+          <w:rFonts w:asciiTheme="majorBidi" w:hAnsiTheme="majorBidi" w:cstheme="majorBidi"/>
+          <w:i/>
+          <w:iCs/>
+          <w:color w:val="333333"/>
+          <w:shd w:val="clear" w:color="auto" w:fill="FFFFFF"/>
+        </w:rPr>
+        <w:t>Phycologia</w:t>
+      </w:r>
+      <w:r>
+        <w:rPr>
+          <w:rFonts w:asciiTheme="majorBidi" w:hAnsiTheme="majorBidi" w:cstheme="majorBidi"/>
+          <w:color w:val="333333"/>
+          <w:shd w:val="clear" w:color="auto" w:fill="FFFFFF"/>
+        </w:rPr>
+        <w:t>, </w:t>
+      </w:r>
+      <w:r>
+        <w:rPr>
+          <w:rFonts w:asciiTheme="majorBidi" w:hAnsiTheme="majorBidi" w:cstheme="majorBidi"/>
+          <w:i/>
+          <w:iCs/>
+          <w:color w:val="333333"/>
+          <w:shd w:val="clear" w:color="auto" w:fill="FFFFFF"/>
+        </w:rPr>
+        <w:t>40</w:t>
+      </w:r>
+      <w:r>
+        <w:rPr>
+          <w:rFonts w:asciiTheme="majorBidi" w:hAnsiTheme="majorBidi" w:cstheme="majorBidi"/>
+          <w:color w:val="333333"/>
+          <w:shd w:val="clear" w:color="auto" w:fill="FFFFFF"/>
+        </w:rPr>
+        <w:t xml:space="preserve">, 88–96. </w:t>
+      </w:r>
+      <w:hyperlink r:id="rId10" w:history="1">
+        <w:r>
+          <w:rPr>
+            <w:rStyle w:val="Hyperlink"/>
+            <w:rFonts w:asciiTheme="majorBidi" w:hAnsiTheme="majorBidi" w:cstheme="majorBidi"/>
+            <w:shd w:val="clear" w:color="auto" w:fill="FFFFFF"/>
+          </w:rPr>
+          <w:t>https://doi.org/10.2216/i0031-8884-40-1-88.1</w:t>
+        </w:r>
+      </w:hyperlink>
     </w:p>
     <w:p>
       <w:pPr>
@@ -2712,12 +2927,23 @@
     <w:name w:val="Hyperlink"/>
     <w:basedOn w:val="DefaultParagraphFont"/>
     <w:uiPriority w:val="99"/>
-    <w:semiHidden/>
     <w:unhideWhenUsed/>
     <w:rsid w:val="004C4370"/>
     <w:rPr>
       <w:color w:val="0000FF"/>
       <w:u w:val="single"/>
+    </w:rPr>
+  </w:style>
+  <w:style w:type="character" w:styleId="UnresolvedMention">
+    <w:name w:val="Unresolved Mention"/>
+    <w:basedOn w:val="DefaultParagraphFont"/>
+    <w:uiPriority w:val="99"/>
+    <w:semiHidden/>
+    <w:unhideWhenUsed/>
+    <w:rsid w:val="00682783"/>
+    <w:rPr>
+      <w:color w:val="605E5C"/>
+      <w:shd w:val="clear" w:color="auto" w:fill="E1DFDD"/>
     </w:rPr>
   </w:style>
 </w:styles>

</xml_diff>